<commit_message>
Add activity diagrams cho Module1
</commit_message>
<xml_diff>
--- a/diagrams/1-analysis/functional/Module1-QLTaikhoan&HoSo/UC102/Đặc tả UC102a-Đăng nhập.docx
+++ b/diagrams/1-analysis/functional/Module1-QLTaikhoan&HoSo/UC102/Đặc tả UC102a-Đăng nhập.docx
@@ -6,6 +6,7 @@
       <w:pPr>
         <w:pStyle w:val="Heading1"/>
       </w:pPr>
+      <w:bookmarkStart w:id="0" w:name="_GoBack"/>
     </w:p>
     <w:tbl>
       <w:tblPr>
@@ -80,8 +81,6 @@
             <w:r>
               <w:t>1</w:t>
             </w:r>
-            <w:bookmarkStart w:id="0" w:name="_GoBack"/>
-            <w:bookmarkEnd w:id="0"/>
             <w:r>
               <w:t>02</w:t>
             </w:r>
@@ -565,6 +564,7 @@
           </w:p>
         </w:tc>
       </w:tr>
+      <w:bookmarkEnd w:id="0"/>
     </w:tbl>
     <w:p>
       <w:pPr>
@@ -12670,7 +12670,7 @@
 </file>
 
 <file path=customXml/itemProps1.xml><?xml version="1.0" encoding="utf-8"?>
-<ds:datastoreItem xmlns:ds="http://schemas.openxmlformats.org/officeDocument/2006/customXml" ds:itemID="{167FF94C-C8AA-42CD-8051-158030C9A3E3}">
+<ds:datastoreItem xmlns:ds="http://schemas.openxmlformats.org/officeDocument/2006/customXml" ds:itemID="{9F010046-1F1E-4225-9CBC-F42DDFC7EC0B}">
   <ds:schemaRefs>
     <ds:schemaRef ds:uri="http://schemas.openxmlformats.org/officeDocument/2006/bibliography"/>
   </ds:schemaRefs>

</xml_diff>